<commit_message>
chap 13 and 14
</commit_message>
<xml_diff>
--- a/docs/handouts/Ch10_FirstProgram_STUDENT.docx
+++ b/docs/handouts/Ch10_FirstProgram_STUDENT.docx
@@ -170,115 +170,115 @@
           <w:i w:val="false"/>
           <w:iCs w:val="false"/>
         </w:rPr>
-        <w:t xml:space="preserve">Time to write real </w:t>
-      </w:r>
-      <w:r>
-        <w:rPr>
-          <w:b/>
-          <w:bCs/>
-          <w:i w:val="false"/>
-          <w:iCs w:val="false"/>
-        </w:rPr>
-        <w:t xml:space="preserve">C++</w:t>
-      </w:r>
-      <w:r>
-        <w:rPr>
-          <w:b w:val="false"/>
-          <w:bCs w:val="false"/>
-          <w:i w:val="false"/>
-          <w:iCs w:val="false"/>
-        </w:rPr>
-        <w:t xml:space="preserve">, send it to your robot, and watch it run. You'll set up </w:t>
-      </w:r>
-      <w:r>
-        <w:rPr>
-          <w:b/>
-          <w:bCs/>
-          <w:i w:val="false"/>
-          <w:iCs w:val="false"/>
-        </w:rPr>
-        <w:t xml:space="preserve">Visual Studio Code</w:t>
-      </w:r>
-      <w:r>
-        <w:rPr>
-          <w:b w:val="false"/>
-          <w:bCs w:val="false"/>
-          <w:i w:val="false"/>
-          <w:iCs w:val="false"/>
-        </w:rPr>
-        <w:t xml:space="preserve"> with the </w:t>
-      </w:r>
-      <w:r>
-        <w:rPr>
-          <w:b/>
-          <w:bCs/>
-          <w:i w:val="false"/>
-          <w:iCs w:val="false"/>
-        </w:rPr>
-        <w:t xml:space="preserve">VEX extension</w:t>
-      </w:r>
-      <w:r>
-        <w:rPr>
-          <w:b w:val="false"/>
-          <w:bCs w:val="false"/>
-          <w:i w:val="false"/>
-          <w:iCs w:val="false"/>
-        </w:rPr>
-        <w:t xml:space="preserve">, create an </w:t>
-      </w:r>
-      <w:r>
-        <w:rPr>
-          <w:b/>
-          <w:bCs/>
-          <w:i w:val="false"/>
-          <w:iCs w:val="false"/>
-        </w:rPr>
-        <w:t xml:space="preserve">EXP project</w:t>
-      </w:r>
-      <w:r>
-        <w:rPr>
-          <w:b w:val="false"/>
-          <w:bCs w:val="false"/>
-          <w:i w:val="false"/>
-          <w:iCs w:val="false"/>
-        </w:rPr>
-        <w:t xml:space="preserve">, learn the </w:t>
-      </w:r>
-      <w:r>
-        <w:rPr>
-          <w:b/>
-          <w:bCs/>
-          <w:i w:val="false"/>
-          <w:iCs w:val="false"/>
-        </w:rPr>
-        <w:t xml:space="preserve">anatomy of a program</w:t>
-      </w:r>
-      <w:r>
-        <w:rPr>
-          <w:b w:val="false"/>
-          <w:bCs w:val="false"/>
-          <w:i w:val="false"/>
-          <w:iCs w:val="false"/>
-        </w:rPr>
-        <w:t xml:space="preserve"> (what every line is for), the commands that make a motor </w:t>
-      </w:r>
-      <w:r>
-        <w:rPr>
-          <w:b/>
-          <w:bCs/>
-          <w:i w:val="false"/>
-          <w:iCs w:val="false"/>
-        </w:rPr>
-        <w:t xml:space="preserve">spin, wait, and stop</w:t>
-      </w:r>
-      <w:r>
-        <w:rPr>
-          <w:b w:val="false"/>
-          <w:bCs w:val="false"/>
-          <w:i w:val="false"/>
-          <w:iCs w:val="false"/>
-        </w:rPr>
-        <w:t xml:space="preserve">, and the </w:t>
+        <w:t xml:space="preserve">Since week 1 you've been writing code in the starter — typing between the two purple lines and leaving everything else alone. This is where you open up those other lines and read the </w:t>
+      </w:r>
+      <w:r>
+        <w:rPr>
+          <w:b/>
+          <w:bCs/>
+          <w:i w:val="false"/>
+          <w:iCs w:val="false"/>
+        </w:rPr>
+        <w:t xml:space="preserve">whole program</w:t>
+      </w:r>
+      <w:r>
+        <w:rPr>
+          <w:b w:val="false"/>
+          <w:bCs w:val="false"/>
+          <w:i w:val="false"/>
+          <w:iCs w:val="false"/>
+        </w:rPr>
+        <w:t xml:space="preserve">: the </w:t>
+      </w:r>
+      <w:r>
+        <w:rPr>
+          <w:b/>
+          <w:bCs/>
+          <w:i w:val="false"/>
+          <w:iCs w:val="false"/>
+        </w:rPr>
+        <w:t xml:space="preserve">setup lines</w:t>
+      </w:r>
+      <w:r>
+        <w:rPr>
+          <w:b w:val="false"/>
+          <w:bCs w:val="false"/>
+          <w:i w:val="false"/>
+          <w:iCs w:val="false"/>
+        </w:rPr>
+        <w:t xml:space="preserve">, the </w:t>
+      </w:r>
+      <w:r>
+        <w:rPr>
+          <w:b/>
+          <w:bCs/>
+          <w:i w:val="false"/>
+          <w:iCs w:val="false"/>
+        </w:rPr>
+        <w:t xml:space="preserve">device list</w:t>
+      </w:r>
+      <w:r>
+        <w:rPr>
+          <w:b w:val="false"/>
+          <w:bCs w:val="false"/>
+          <w:i w:val="false"/>
+          <w:iCs w:val="false"/>
+        </w:rPr>
+        <w:t xml:space="preserve">, </w:t>
+      </w:r>
+      <w:r>
+        <w:rPr>
+          <w:b/>
+          <w:bCs/>
+          <w:i w:val="false"/>
+          <w:iCs w:val="false"/>
+        </w:rPr>
+        <w:t xml:space="preserve">int main()</w:t>
+      </w:r>
+      <w:r>
+        <w:rPr>
+          <w:b w:val="false"/>
+          <w:bCs w:val="false"/>
+          <w:i w:val="false"/>
+          <w:iCs w:val="false"/>
+        </w:rPr>
+        <w:t xml:space="preserve">, </w:t>
+      </w:r>
+      <w:r>
+        <w:rPr>
+          <w:b/>
+          <w:bCs/>
+          <w:i w:val="false"/>
+          <w:iCs w:val="false"/>
+        </w:rPr>
+        <w:t xml:space="preserve">vexcodeInit()</w:t>
+      </w:r>
+      <w:r>
+        <w:rPr>
+          <w:b w:val="false"/>
+          <w:bCs w:val="false"/>
+          <w:i w:val="false"/>
+          <w:iCs w:val="false"/>
+        </w:rPr>
+        <w:t xml:space="preserve">, and the curly braces. Once you know what each part does you're not limited to the region anymore — you can write a complete program yourself, and turn the </w:t>
+      </w:r>
+      <w:r>
+        <w:rPr>
+          <w:b/>
+          <w:bCs/>
+          <w:i w:val="false"/>
+          <w:iCs w:val="false"/>
+        </w:rPr>
+        <w:t xml:space="preserve">pseudocode</w:t>
+      </w:r>
+      <w:r>
+        <w:rPr>
+          <w:b w:val="false"/>
+          <w:bCs w:val="false"/>
+          <w:i w:val="false"/>
+          <w:iCs w:val="false"/>
+        </w:rPr>
+        <w:t xml:space="preserve"> you planned in Chapter 9 into real, running code. It's the same </w:t>
       </w:r>
       <w:r>
         <w:rPr>
@@ -296,7 +296,7 @@
           <w:i w:val="false"/>
           <w:iCs w:val="false"/>
         </w:rPr>
-        <w:t xml:space="preserve"> workflow over USB-C. Then you'll take the pseudocode you wrote in Chapter 9 and make it real — one tested piece at a time. Read Chapter 10 in the textbook for the full walkthrough.</w:t>
+        <w:t xml:space="preserve"> loop you already know, now with nothing hidden. Read Chapter 10 in the textbook for the full walkthrough.</w:t>
       </w:r>
     </w:p>
     <w:p>
@@ -642,7 +642,7 @@
           <w:i w:val="false"/>
           <w:iCs w:val="false"/>
         </w:rPr>
-        <w:t xml:space="preserve">A complete first program — it spins one motor at half speed for five seconds, then stops. Notice it's just a list of steps, top to bottom, like your pseudocode:</w:t>
+        <w:t xml:space="preserve">A complete program — and you'll recognize most of it. It's the AR-Starter you've been using: the setup lines, your motor, main, and a few commands in the middle (this one sets a speed, then spins for five seconds and stops). This time we read every line, including the ones you've been skipping:</w:t>
       </w:r>
     </w:p>
     <w:p>
@@ -660,7 +660,7 @@
           <w:sz w:val="16"/>
           <w:szCs w:val="16"/>
         </w:rPr>
-        <w:t xml:space="preserve">Your first VEX C++ program</w:t>
+        <w:t xml:space="preserve">The whole program — nothing hidden this time</w:t>
       </w:r>
     </w:p>
     <w:tbl>

</xml_diff>